<commit_message>
docs: embed live demo output screenshots and operational explanations into Section 6.1
</commit_message>
<xml_diff>
--- a/docs/DeceptionNet_SN_Computer_Science_Manuscript.docx
+++ b/docs/DeceptionNet_SN_Computer_Science_Manuscript.docx
@@ -1807,6 +1807,201 @@
         <w:t>Pipeline Architecture Flow:</w:t>
         <w:br/>
         <w:t>Attacker Probe → Decoy Container (honeypot_net) → Shared Volume Log → Forwarder Daemon → JSON Normalization → Central Ingestion API (deceptionnet network) → Deterministic Rule Engine → Additive Scoring &amp; Correlation → PostgreSQL Storage → Live WebSocket Broadcast → Operator Dashboard &amp; Post-Capture AI Incident Report (PDF).</w:t>
+      </w:r>
+    </w:p>
+    <w:p>
+      <w:pPr>
+        <w:spacing w:before="160" w:after="40"/>
+      </w:pPr>
+      <w:r>
+        <w:rPr>
+          <w:b/>
+          <w:color w:val="2E5B88"/>
+          <w:sz w:val="22"/>
+        </w:rPr>
+        <w:t>6.1 Sample System Output and Live Demo Trace</w:t>
+      </w:r>
+    </w:p>
+    <w:p>
+      <w:r>
+        <w:t>The figures below present authentic operational outputs captured during live execution of the DeceptionNet active defense pipeline across the Docker Compose testbed. They demonstrate end-to-end execution: from adversary attack script initiation, through real-time telemetry streaming and threat scoring on the operator dashboard, to automated post-capture incident report synthesis.</w:t>
+      </w:r>
+    </w:p>
+    <w:p>
+      <w:pPr>
+        <w:jc w:val="center"/>
+      </w:pPr>
+    </w:p>
+    <w:p>
+      <w:r>
+        <w:drawing>
+          <wp:inline xmlns:a="http://schemas.openxmlformats.org/drawingml/2006/main" xmlns:pic="http://schemas.openxmlformats.org/drawingml/2006/picture">
+            <wp:extent cx="5303520" cy="3288182"/>
+            <wp:docPr id="1" name="Picture 1"/>
+            <wp:cNvGraphicFramePr>
+              <a:graphicFrameLocks noChangeAspect="1"/>
+            </wp:cNvGraphicFramePr>
+            <a:graphic>
+              <a:graphicData uri="http://schemas.openxmlformats.org/drawingml/2006/picture">
+                <pic:pic>
+                  <pic:nvPicPr>
+                    <pic:cNvPr id="0" name="live_attack_terminal.png"/>
+                    <pic:cNvPicPr/>
+                  </pic:nvPicPr>
+                  <pic:blipFill>
+                    <a:blip r:embed="rId10"/>
+                    <a:stretch>
+                      <a:fillRect/>
+                    </a:stretch>
+                  </pic:blipFill>
+                  <pic:spPr>
+                    <a:xfrm>
+                      <a:off x="0" y="0"/>
+                      <a:ext cx="5303520" cy="3288182"/>
+                    </a:xfrm>
+                    <a:prstGeom prst="rect"/>
+                  </pic:spPr>
+                </pic:pic>
+              </a:graphicData>
+            </a:graphic>
+          </wp:inline>
+        </w:drawing>
+      </w:r>
+    </w:p>
+    <w:p>
+      <w:pPr>
+        <w:spacing w:after="120"/>
+        <w:jc w:val="center"/>
+      </w:pPr>
+      <w:r>
+        <w:rPr>
+          <w:i/>
+          <w:sz w:val="17"/>
+        </w:rPr>
+        <w:t>Fig. 1: Live multi-stage attack simulation execution — Automated attack script (attacker/scripts/full-attack.sh) executing inside the containerized attacker environment (172.21.0.5), chaining SQLi authentication bypass, brute-force credential guessing, command injection, path traversal, reflected XSS, and web shell upload.</w:t>
+      </w:r>
+    </w:p>
+    <w:p>
+      <w:r>
+        <w:t>Figure 1 illustrates the live execution of the multi-stage attack harness within the attacker container (172.21.0.5). The harness executes six sequential attack stages against the vulnerable web decoy (attack-target:9090). In Stage 1, an SQL injection payload (admin'--) bypasses authentication, and curl stores the resulting session cookie into a local cookie-jar. In Stage 2, five unauthenticated credential-guessing attempts are launched without cookies; each generates an independent session logged at severity 0.5. In Stages 3 through 6, post-exploitation payloads present the stored session cookie, enabling DeceptionNet to bind all subsequent exploitation events—including system reconnaissance (whoami, uname), credential dumping (/etc/passwd), file retrieval, reflected XSS, and PHP web shell upload—into a single persistent campaign session.</w:t>
+      </w:r>
+    </w:p>
+    <w:p>
+      <w:pPr>
+        <w:jc w:val="center"/>
+      </w:pPr>
+    </w:p>
+    <w:p>
+      <w:r>
+        <w:drawing>
+          <wp:inline xmlns:a="http://schemas.openxmlformats.org/drawingml/2006/main" xmlns:pic="http://schemas.openxmlformats.org/drawingml/2006/picture">
+            <wp:extent cx="5303520" cy="4419600"/>
+            <wp:docPr id="2" name="Picture 2"/>
+            <wp:cNvGraphicFramePr>
+              <a:graphicFrameLocks noChangeAspect="1"/>
+            </wp:cNvGraphicFramePr>
+            <a:graphic>
+              <a:graphicData uri="http://schemas.openxmlformats.org/drawingml/2006/picture">
+                <pic:pic>
+                  <pic:nvPicPr>
+                    <pic:cNvPr id="0" name="dashboard-main.png"/>
+                    <pic:cNvPicPr/>
+                  </pic:nvPicPr>
+                  <pic:blipFill>
+                    <a:blip r:embed="rId11"/>
+                    <a:stretch>
+                      <a:fillRect/>
+                    </a:stretch>
+                  </pic:blipFill>
+                  <pic:spPr>
+                    <a:xfrm>
+                      <a:off x="0" y="0"/>
+                      <a:ext cx="5303520" cy="4419600"/>
+                    </a:xfrm>
+                    <a:prstGeom prst="rect"/>
+                  </pic:spPr>
+                </pic:pic>
+              </a:graphicData>
+            </a:graphic>
+          </wp:inline>
+        </w:drawing>
+      </w:r>
+    </w:p>
+    <w:p>
+      <w:pPr>
+        <w:spacing w:after="120"/>
+        <w:jc w:val="center"/>
+      </w:pPr>
+      <w:r>
+        <w:rPr>
+          <w:i/>
+          <w:sz w:val="17"/>
+        </w:rPr>
+        <w:t>Fig. 2: DeceptionNet live operator dashboard — Real-time telemetry feed displaying isolated and correlated decoy sessions, source IP attribution, monotonic additive threat severity scores (Critical tier: 26.0), and automated MITRE ATT&amp;CK technique tags.</w:t>
+      </w:r>
+    </w:p>
+    <w:p>
+      <w:r>
+        <w:t>Figure 2 displays the operator web dashboard streaming live telemetry over WebSockets. Each incoming decoy event is evaluated by the deterministic MITRE ATT&amp;CK rule engine in under 0.06 ms. As the adversary progresses through the attack chain, the session card dynamically updates: positively identified techniques (e.g., T1003.008, T1078, T1505.003) appear as color-coded badges, and the cumulative severity score increases monotonically. The primary campaign session escalates from 4.0 (Elevated) to 26.0 (Critical), triggering prominent visual alerts for security operations staff, while unauthenticated brute-force probes remain isolated in the Low tier.</w:t>
+      </w:r>
+    </w:p>
+    <w:p>
+      <w:pPr>
+        <w:jc w:val="center"/>
+      </w:pPr>
+    </w:p>
+    <w:p>
+      <w:r>
+        <w:drawing>
+          <wp:inline xmlns:a="http://schemas.openxmlformats.org/drawingml/2006/main" xmlns:pic="http://schemas.openxmlformats.org/drawingml/2006/picture">
+            <wp:extent cx="5303520" cy="3288182"/>
+            <wp:docPr id="3" name="Picture 3"/>
+            <wp:cNvGraphicFramePr>
+              <a:graphicFrameLocks noChangeAspect="1"/>
+            </wp:cNvGraphicFramePr>
+            <a:graphic>
+              <a:graphicData uri="http://schemas.openxmlformats.org/drawingml/2006/picture">
+                <pic:pic>
+                  <pic:nvPicPr>
+                    <pic:cNvPr id="0" name="incident_report_preview.png"/>
+                    <pic:cNvPicPr/>
+                  </pic:nvPicPr>
+                  <pic:blipFill>
+                    <a:blip r:embed="rId12"/>
+                    <a:stretch>
+                      <a:fillRect/>
+                    </a:stretch>
+                  </pic:blipFill>
+                  <pic:spPr>
+                    <a:xfrm>
+                      <a:off x="0" y="0"/>
+                      <a:ext cx="5303520" cy="3288182"/>
+                    </a:xfrm>
+                    <a:prstGeom prst="rect"/>
+                  </pic:spPr>
+                </pic:pic>
+              </a:graphicData>
+            </a:graphic>
+          </wp:inline>
+        </w:drawing>
+      </w:r>
+    </w:p>
+    <w:p>
+      <w:pPr>
+        <w:spacing w:after="120"/>
+        <w:jc w:val="center"/>
+      </w:pPr>
+      <w:r>
+        <w:rPr>
+          <w:i/>
+          <w:sz w:val="17"/>
+        </w:rPr>
+        <w:t>Fig. 3: Decoupled AI threat intelligence and automated incident report — Generated post-capture incident summary compiling chronological session events, verified ATT&amp;CK techniques, and operator triage recommendations without exposing generative models to the live execution loop.</w:t>
+      </w:r>
+    </w:p>
+    <w:p>
+      <w:r>
+        <w:t>Figure 3 demonstrates the output of the decoupled AI reporting service (ai-service). Once a session is concluded or flagged for analysis, an analyst can trigger automated PDF report generation. The AI engine synthesizes committed events into an executive incident summary, details session timelines and metadata, and tabulates verified ATT&amp;CK techniques. To guarantee fidelity, every semantic recommendation is passed through a lexical grounding filter, verifying that technique keywords (&gt; 3 characters) appear in raw event logs before inclusion in the final report.</w:t>
       </w:r>
     </w:p>
     <w:p>

</xml_diff>